<commit_message>
Update ghosting test documents
Updated the TestBoard_ADC124 and TestBoard_7953 ghosting test Word documents.

Co-Authored-By: Claude Sonnet 5.5 <noreply@anthropic.com>
</commit_message>
<xml_diff>
--- a/docs/testing/benchmarks/testboard-7953/Ghosting Tests TestBoard_7953.docx
+++ b/docs/testing/benchmarks/testboard-7953/Ghosting Tests TestBoard_7953.docx
@@ -2362,20 +2362,21 @@
       <w:tblPr>
         <w:tblStyle w:val="TableGrid"/>
         <w:tblW w:w="0" w:type="auto"/>
-        <w:tblInd w:w="720" w:type="dxa"/>
+        <w:tblInd w:w="-95" w:type="dxa"/>
         <w:tblLook w:val="04A0" w:firstRow="1" w:lastRow="0" w:firstColumn="1" w:lastColumn="0" w:noHBand="0" w:noVBand="1"/>
       </w:tblPr>
       <w:tblGrid>
-        <w:gridCol w:w="922"/>
-        <w:gridCol w:w="1140"/>
-        <w:gridCol w:w="1809"/>
-        <w:gridCol w:w="1794"/>
-        <w:gridCol w:w="2965"/>
+        <w:gridCol w:w="797"/>
+        <w:gridCol w:w="995"/>
+        <w:gridCol w:w="1581"/>
+        <w:gridCol w:w="1629"/>
+        <w:gridCol w:w="2517"/>
+        <w:gridCol w:w="1926"/>
       </w:tblGrid>
       <w:tr>
         <w:tc>
           <w:tcPr>
-            <w:tcW w:w="922" w:type="dxa"/>
+            <w:tcW w:w="797" w:type="dxa"/>
           </w:tcPr>
           <w:p>
             <w:pPr>
@@ -2397,7 +2398,7 @@
         </w:tc>
         <w:tc>
           <w:tcPr>
-            <w:tcW w:w="1140" w:type="dxa"/>
+            <w:tcW w:w="995" w:type="dxa"/>
           </w:tcPr>
           <w:p>
             <w:pPr>
@@ -2419,7 +2420,7 @@
         </w:tc>
         <w:tc>
           <w:tcPr>
-            <w:tcW w:w="1809" w:type="dxa"/>
+            <w:tcW w:w="1581" w:type="dxa"/>
           </w:tcPr>
           <w:p>
             <w:pPr>
@@ -2441,7 +2442,7 @@
         </w:tc>
         <w:tc>
           <w:tcPr>
-            <w:tcW w:w="1794" w:type="dxa"/>
+            <w:tcW w:w="1629" w:type="dxa"/>
           </w:tcPr>
           <w:p>
             <w:pPr>
@@ -2463,23 +2464,45 @@
         </w:tc>
         <w:tc>
           <w:tcPr>
-            <w:tcW w:w="2965" w:type="dxa"/>
-          </w:tcPr>
-          <w:p>
-            <w:pPr>
-              <w:pStyle w:val="ListParagraph"/>
-              <w:ind w:left="0"/>
-              <w:rPr>
-                <w:b/>
-                <w:bCs/>
-              </w:rPr>
-            </w:pPr>
-            <w:r>
-              <w:rPr>
-                <w:b/>
-                <w:bCs/>
-              </w:rPr>
-              <w:t>Results</w:t>
+            <w:tcW w:w="2517" w:type="dxa"/>
+          </w:tcPr>
+          <w:p>
+            <w:pPr>
+              <w:pStyle w:val="ListParagraph"/>
+              <w:ind w:left="0"/>
+              <w:rPr>
+                <w:b/>
+                <w:bCs/>
+              </w:rPr>
+            </w:pPr>
+            <w:r>
+              <w:rPr>
+                <w:b/>
+                <w:bCs/>
+              </w:rPr>
+              <w:t>Ghosting Results</w:t>
+            </w:r>
+          </w:p>
+        </w:tc>
+        <w:tc>
+          <w:tcPr>
+            <w:tcW w:w="1926" w:type="dxa"/>
+          </w:tcPr>
+          <w:p>
+            <w:pPr>
+              <w:pStyle w:val="ListParagraph"/>
+              <w:ind w:left="0"/>
+              <w:rPr>
+                <w:b/>
+                <w:bCs/>
+              </w:rPr>
+            </w:pPr>
+            <w:r>
+              <w:rPr>
+                <w:b/>
+                <w:bCs/>
+              </w:rPr>
+              <w:t>Signal P-to-P</w:t>
             </w:r>
           </w:p>
         </w:tc>
@@ -2487,7 +2510,7 @@
       <w:tr>
         <w:tc>
           <w:tcPr>
-            <w:tcW w:w="922" w:type="dxa"/>
+            <w:tcW w:w="797" w:type="dxa"/>
           </w:tcPr>
           <w:p>
             <w:pPr>
@@ -2501,7 +2524,7 @@
         </w:tc>
         <w:tc>
           <w:tcPr>
-            <w:tcW w:w="1140" w:type="dxa"/>
+            <w:tcW w:w="995" w:type="dxa"/>
           </w:tcPr>
           <w:p>
             <w:pPr>
@@ -2515,7 +2538,7 @@
         </w:tc>
         <w:tc>
           <w:tcPr>
-            <w:tcW w:w="1809" w:type="dxa"/>
+            <w:tcW w:w="1581" w:type="dxa"/>
           </w:tcPr>
           <w:p>
             <w:pPr>
@@ -2529,7 +2552,7 @@
         </w:tc>
         <w:tc>
           <w:tcPr>
-            <w:tcW w:w="1794" w:type="dxa"/>
+            <w:tcW w:w="1629" w:type="dxa"/>
           </w:tcPr>
           <w:p>
             <w:pPr>
@@ -2543,7 +2566,7 @@
         </w:tc>
         <w:tc>
           <w:tcPr>
-            <w:tcW w:w="2965" w:type="dxa"/>
+            <w:tcW w:w="2517" w:type="dxa"/>
           </w:tcPr>
           <w:p>
             <w:pPr>
@@ -2552,6 +2575,20 @@
             </w:pPr>
             <w:r>
               <w:t>Very small ghosting (less than 20%). No ghosting following the next channel.</w:t>
+            </w:r>
+          </w:p>
+        </w:tc>
+        <w:tc>
+          <w:tcPr>
+            <w:tcW w:w="1926" w:type="dxa"/>
+          </w:tcPr>
+          <w:p>
+            <w:pPr>
+              <w:pStyle w:val="ListParagraph"/>
+              <w:ind w:left="0"/>
+            </w:pPr>
+            <w:r>
+              <w:t>130mv</w:t>
             </w:r>
           </w:p>
         </w:tc>
@@ -2559,7 +2596,7 @@
       <w:tr>
         <w:tc>
           <w:tcPr>
-            <w:tcW w:w="922" w:type="dxa"/>
+            <w:tcW w:w="797" w:type="dxa"/>
           </w:tcPr>
           <w:p>
             <w:pPr>
@@ -2573,7 +2610,7 @@
         </w:tc>
         <w:tc>
           <w:tcPr>
-            <w:tcW w:w="1140" w:type="dxa"/>
+            <w:tcW w:w="995" w:type="dxa"/>
           </w:tcPr>
           <w:p>
             <w:pPr>
@@ -2587,7 +2624,7 @@
         </w:tc>
         <w:tc>
           <w:tcPr>
-            <w:tcW w:w="1809" w:type="dxa"/>
+            <w:tcW w:w="1581" w:type="dxa"/>
           </w:tcPr>
           <w:p>
             <w:pPr>
@@ -2601,7 +2638,7 @@
         </w:tc>
         <w:tc>
           <w:tcPr>
-            <w:tcW w:w="1794" w:type="dxa"/>
+            <w:tcW w:w="1629" w:type="dxa"/>
           </w:tcPr>
           <w:p>
             <w:pPr>
@@ -2615,7 +2652,7 @@
         </w:tc>
         <w:tc>
           <w:tcPr>
-            <w:tcW w:w="2965" w:type="dxa"/>
+            <w:tcW w:w="2517" w:type="dxa"/>
           </w:tcPr>
           <w:p>
             <w:pPr>
@@ -2624,6 +2661,20 @@
             </w:pPr>
             <w:r>
               <w:t>No ghosting observed.</w:t>
+            </w:r>
+          </w:p>
+        </w:tc>
+        <w:tc>
+          <w:tcPr>
+            <w:tcW w:w="1926" w:type="dxa"/>
+          </w:tcPr>
+          <w:p>
+            <w:pPr>
+              <w:pStyle w:val="ListParagraph"/>
+              <w:ind w:left="0"/>
+            </w:pPr>
+            <w:r>
+              <w:t>100mv</w:t>
             </w:r>
           </w:p>
         </w:tc>
@@ -2631,7 +2682,7 @@
       <w:tr>
         <w:tc>
           <w:tcPr>
-            <w:tcW w:w="922" w:type="dxa"/>
+            <w:tcW w:w="797" w:type="dxa"/>
           </w:tcPr>
           <w:p>
             <w:pPr>
@@ -2645,7 +2696,7 @@
         </w:tc>
         <w:tc>
           <w:tcPr>
-            <w:tcW w:w="1140" w:type="dxa"/>
+            <w:tcW w:w="995" w:type="dxa"/>
           </w:tcPr>
           <w:p>
             <w:pPr>
@@ -2659,7 +2710,7 @@
         </w:tc>
         <w:tc>
           <w:tcPr>
-            <w:tcW w:w="1809" w:type="dxa"/>
+            <w:tcW w:w="1581" w:type="dxa"/>
           </w:tcPr>
           <w:p>
             <w:pPr>
@@ -2673,7 +2724,7 @@
         </w:tc>
         <w:tc>
           <w:tcPr>
-            <w:tcW w:w="1794" w:type="dxa"/>
+            <w:tcW w:w="1629" w:type="dxa"/>
           </w:tcPr>
           <w:p>
             <w:pPr>
@@ -2687,7 +2738,7 @@
         </w:tc>
         <w:tc>
           <w:tcPr>
-            <w:tcW w:w="2965" w:type="dxa"/>
+            <w:tcW w:w="2517" w:type="dxa"/>
           </w:tcPr>
           <w:p>
             <w:pPr>
@@ -2696,6 +2747,20 @@
             </w:pPr>
             <w:r>
               <w:t>No ghosting observed.</w:t>
+            </w:r>
+          </w:p>
+        </w:tc>
+        <w:tc>
+          <w:tcPr>
+            <w:tcW w:w="1926" w:type="dxa"/>
+          </w:tcPr>
+          <w:p>
+            <w:pPr>
+              <w:pStyle w:val="ListParagraph"/>
+              <w:ind w:left="0"/>
+            </w:pPr>
+            <w:r>
+              <w:t>150mv</w:t>
             </w:r>
           </w:p>
         </w:tc>
@@ -2703,7 +2768,7 @@
       <w:tr>
         <w:tc>
           <w:tcPr>
-            <w:tcW w:w="922" w:type="dxa"/>
+            <w:tcW w:w="797" w:type="dxa"/>
           </w:tcPr>
           <w:p>
             <w:pPr>
@@ -2717,7 +2782,7 @@
         </w:tc>
         <w:tc>
           <w:tcPr>
-            <w:tcW w:w="1140" w:type="dxa"/>
+            <w:tcW w:w="995" w:type="dxa"/>
           </w:tcPr>
           <w:p>
             <w:pPr>
@@ -2731,7 +2796,7 @@
         </w:tc>
         <w:tc>
           <w:tcPr>
-            <w:tcW w:w="1809" w:type="dxa"/>
+            <w:tcW w:w="1581" w:type="dxa"/>
           </w:tcPr>
           <w:p>
             <w:pPr>
@@ -2745,7 +2810,7 @@
         </w:tc>
         <w:tc>
           <w:tcPr>
-            <w:tcW w:w="1794" w:type="dxa"/>
+            <w:tcW w:w="1629" w:type="dxa"/>
           </w:tcPr>
           <w:p>
             <w:pPr>
@@ -2759,7 +2824,7 @@
         </w:tc>
         <w:tc>
           <w:tcPr>
-            <w:tcW w:w="2965" w:type="dxa"/>
+            <w:tcW w:w="2517" w:type="dxa"/>
           </w:tcPr>
           <w:p>
             <w:pPr>
@@ -2769,13 +2834,24 @@
             <w:r>
               <w:t>Almost no ghosting observed (about 5%)</w:t>
             </w:r>
+          </w:p>
+        </w:tc>
+        <w:tc>
+          <w:tcPr>
+            <w:tcW w:w="1926" w:type="dxa"/>
+          </w:tcPr>
+          <w:p>
+            <w:pPr>
+              <w:pStyle w:val="ListParagraph"/>
+              <w:ind w:left="0"/>
+            </w:pPr>
           </w:p>
         </w:tc>
       </w:tr>
       <w:tr>
         <w:tc>
           <w:tcPr>
-            <w:tcW w:w="922" w:type="dxa"/>
+            <w:tcW w:w="797" w:type="dxa"/>
           </w:tcPr>
           <w:p>
             <w:pPr>
@@ -2789,7 +2865,7 @@
         </w:tc>
         <w:tc>
           <w:tcPr>
-            <w:tcW w:w="1140" w:type="dxa"/>
+            <w:tcW w:w="995" w:type="dxa"/>
           </w:tcPr>
           <w:p>
             <w:pPr>
@@ -2803,7 +2879,7 @@
         </w:tc>
         <w:tc>
           <w:tcPr>
-            <w:tcW w:w="1809" w:type="dxa"/>
+            <w:tcW w:w="1581" w:type="dxa"/>
           </w:tcPr>
           <w:p>
             <w:pPr>
@@ -2817,7 +2893,7 @@
         </w:tc>
         <w:tc>
           <w:tcPr>
-            <w:tcW w:w="1794" w:type="dxa"/>
+            <w:tcW w:w="1629" w:type="dxa"/>
           </w:tcPr>
           <w:p>
             <w:pPr>
@@ -2831,7 +2907,7 @@
         </w:tc>
         <w:tc>
           <w:tcPr>
-            <w:tcW w:w="2965" w:type="dxa"/>
+            <w:tcW w:w="2517" w:type="dxa"/>
           </w:tcPr>
           <w:p>
             <w:pPr>
@@ -2841,13 +2917,24 @@
             <w:r>
               <w:t>No ghosting observed.</w:t>
             </w:r>
+          </w:p>
+        </w:tc>
+        <w:tc>
+          <w:tcPr>
+            <w:tcW w:w="1926" w:type="dxa"/>
+          </w:tcPr>
+          <w:p>
+            <w:pPr>
+              <w:pStyle w:val="ListParagraph"/>
+              <w:ind w:left="0"/>
+            </w:pPr>
           </w:p>
         </w:tc>
       </w:tr>
       <w:tr>
         <w:tc>
           <w:tcPr>
-            <w:tcW w:w="922" w:type="dxa"/>
+            <w:tcW w:w="797" w:type="dxa"/>
           </w:tcPr>
           <w:p>
             <w:pPr>
@@ -2861,7 +2948,7 @@
         </w:tc>
         <w:tc>
           <w:tcPr>
-            <w:tcW w:w="1140" w:type="dxa"/>
+            <w:tcW w:w="995" w:type="dxa"/>
           </w:tcPr>
           <w:p>
             <w:pPr>
@@ -2875,7 +2962,7 @@
         </w:tc>
         <w:tc>
           <w:tcPr>
-            <w:tcW w:w="1809" w:type="dxa"/>
+            <w:tcW w:w="1581" w:type="dxa"/>
           </w:tcPr>
           <w:p>
             <w:pPr>
@@ -2889,7 +2976,7 @@
         </w:tc>
         <w:tc>
           <w:tcPr>
-            <w:tcW w:w="1794" w:type="dxa"/>
+            <w:tcW w:w="1629" w:type="dxa"/>
           </w:tcPr>
           <w:p>
             <w:pPr>
@@ -2903,7 +2990,7 @@
         </w:tc>
         <w:tc>
           <w:tcPr>
-            <w:tcW w:w="2965" w:type="dxa"/>
+            <w:tcW w:w="2517" w:type="dxa"/>
           </w:tcPr>
           <w:p>
             <w:pPr>
@@ -2913,6 +3000,17 @@
             <w:r>
               <w:t>No ghosting observed.</w:t>
             </w:r>
+          </w:p>
+        </w:tc>
+        <w:tc>
+          <w:tcPr>
+            <w:tcW w:w="1926" w:type="dxa"/>
+          </w:tcPr>
+          <w:p>
+            <w:pPr>
+              <w:pStyle w:val="ListParagraph"/>
+              <w:ind w:left="0"/>
+            </w:pPr>
           </w:p>
         </w:tc>
       </w:tr>

</xml_diff>